<commit_message>
chore: add weekly report 2026-05-12_weekly_report.docx
</commit_message>
<xml_diff>
--- a/reports/2026-05-12_weekly_report.docx
+++ b/reports/2026-05-12_weekly_report.docx
@@ -62,7 +62,7 @@
         <w:rPr>
           <w:sz w:val="20"/>
         </w:rPr>
-        <w:t>영국유학 경쟁사들이 주목하는 트렌드는 크게 3가지로 집약됨:</w:t>
+        <w:t>영국유학 경쟁사들은 이번 주 약대·파운데이션 프로그램에 집중했다. SAUK은 영국약대 파운데이션의 가성비 비교와 무료 수속 캠페인을 반복 노출시켰으며, 선더랜드대학교·아스톤대학교 등 지방 약대의 '저학비+높은 진학률' 메시지를 강조했다. 영유닷은 시니어/50대 이상 어학연수 콘텐츠로 차별화된 타겟층을 공략했고, 교수 동반 현장 투어(LJMU 약대)로 신뢰도 높은 콘텐츠를 제작했다.</w:t>
       </w:r>
     </w:p>
     <w:p>
@@ -73,40 +73,7 @@
         <w:rPr>
           <w:sz w:val="20"/>
         </w:rPr>
-        <w:t>1. 시니어/실버 어학연수 공략 심화: 영유닷이 50~60대 어학연수 콘텐츠로 연속 포스팅(5월 6일, 9일, 11일). 기존 영어공부 관점에서 벗어나 심리적 불안감 해소, 실제 후기 중심으로 콘텐츠 제작. 이는 고령화 시대 수요층 개척 시도로 보임.</w:t>
-      </w:r>
-    </w:p>
-    <w:p>
-      <w:pPr>
-        <w:spacing w:after="80"/>
-      </w:pPr>
-      <w:r>
-        <w:rPr>
-          <w:sz w:val="20"/>
-        </w:rPr>
-        <w:t>2. 약학대학(Pharmacy) 진학로드맵 집중 공략: SAUK가 영국약대 파운데이션 관련 콘텐츠 3일 연속 게시(5월 11일), 브라이튼대·선더랜드대·아스톤대 약대 입학조건·비용·장학금을 세분화하여 제공. 높은 입학장벽과 높은 연봉 직업이라는 투명한 정보 공개로 신뢰도 구축.</w:t>
-      </w:r>
-    </w:p>
-    <w:p>
-      <w:pPr>
-        <w:spacing w:after="80"/>
-      </w:pPr>
-      <w:r>
-        <w:rPr>
-          <w:sz w:val="20"/>
-        </w:rPr>
-        <w:t>3. 파운데이션 프로그램의 '가성비' 및 '입학 보장' 강조: 온캠퍼스 런던, 브라이튼 등 파운데이션 과정의 명문대 진학 보장성과 현실적 학비를 강점으로 마케팅. IDP도 "명문대 진학 보장"이라는 카피로 신뢰성 확보.</w:t>
-      </w:r>
-    </w:p>
-    <w:p>
-      <w:pPr>
-        <w:spacing w:after="80"/>
-      </w:pPr>
-      <w:r>
-        <w:rPr>
-          <w:sz w:val="20"/>
-        </w:rPr>
-        <w:t>4. 조기유학·동반유학 카테고리 확산: 사람사랑유학이 윔블던 여학교 동반유학(만 4~11세), 영국조기유학 비인가교 전수조사 콘텐츠 게시. 사교육 관심층의 시큐어한 정보 요구에 대응.</w:t>
+        <w:t>IDP 영국과 영유센은 석사 프로그램(무료 1:1 케어, 5000만원 예산 가능성)을 마케팅하고 있으며, 온캠퍼스 런던 파운데이션이 주요 커뮤니티 칼리지로 부각되었다. 비자 세미나, 장학금 정보, 오픈 파운데이션의 장점 설명 등 실질적 진학 정보 콘텐츠가 우세하다.</w:t>
       </w:r>
     </w:p>
     <w:p/>
@@ -131,40 +98,7 @@
         <w:rPr>
           <w:sz w:val="20"/>
         </w:rPr>
-        <w:t>아트 유학 경쟁사의 콘텐츠량은 제한적이나 특정 전략이 드러남:</w:t>
-      </w:r>
-    </w:p>
-    <w:p>
-      <w:pPr>
-        <w:spacing w:after="80"/>
-      </w:pPr>
-      <w:r>
-        <w:rPr>
-          <w:sz w:val="20"/>
-        </w:rPr>
-        <w:t>1. 네덜란드 미술대학 집중 공략: 워크베르크가 ArtEZ, DAE(디자인 아카데미 아인트호벤), 게리트 리트벨트 아카데미 3개 학교를 연속으로 소개(5월 5일, 11일, 12일). 영국·미국에 비해 낮은 학비, 높은 국제적 평판이 차별화 포인트.</w:t>
-      </w:r>
-    </w:p>
-    <w:p>
-      <w:pPr>
-        <w:spacing w:after="80"/>
-      </w:pPr>
-      <w:r>
-        <w:rPr>
-          <w:sz w:val="20"/>
-        </w:rPr>
-        <w:t>2. 플레이스 시뮬레이션의 LVMH FINAL LIST: 럭셔리 브랜드 진학 정보 공개로 패션 유학 관심층의 구체적 진로 욕구 충족. 희소성 높은 정보로 브랜드 신뢰도 제고.</w:t>
-      </w:r>
-    </w:p>
-    <w:p>
-      <w:pPr>
-        <w:spacing w:after="80"/>
-      </w:pPr>
-      <w:r>
-        <w:rPr>
-          <w:sz w:val="20"/>
-        </w:rPr>
-        <w:t>3. 영국 미술대학 신규 프로그램 마케팅: 미들섹스대학교의 신설 석사 13개 + 20% 등록금 할인(5월 8일)으로 신입생 모집 강화.</w:t>
+        <w:t>워크베르크가 네덜란드 미술유학에 집중하며 아르테즈, DAE(디자인 아카데미 아인트호벤), 게리트 리트벨트 아카데미를 연속 소개하며 "네덜란드 미술유학" 키워드 점유를 노리고 있다. 플레이스시뮬레이션은 LVMH 최종 합격자 리스트 공개로 명성 있는 학생 사례를 활용했다. 영국아트유학은 미들섹스대학교의 신설 석사 13개 과정과 20% 학비 할인 혜택을 강조하며 신입생 확보에 주력했다.</w:t>
       </w:r>
     </w:p>
     <w:p/>
@@ -189,7 +123,7 @@
         <w:rPr>
           <w:sz w:val="20"/>
         </w:rPr>
-        <w:t>종합 유학원의 콘텐츠 전략이 가장 활발하며 다층적 접근이 눈에 띔:</w:t>
+        <w:t>종합 유학원들은 매우 활발한 활동을 보였다. 특히 호주는 '의료 직군(물리치료, 간호, 작업치료) + 영주권' 조합 마케팅이 집중됐으며, 캐나다는 '자녀 무상교육 + 부모 취업' (라임에듀케이션, 캐노유)과 '대학 진학 방향성' (유학피플)에 초점을 맞췄다.</w:t>
       </w:r>
     </w:p>
     <w:p>
@@ -200,7 +134,7 @@
         <w:rPr>
           <w:sz w:val="20"/>
         </w:rPr>
-        <w:t>1. 캐나다 유학의 '교육 철학·육아 병행' 소구: 라임에듀케이션이 한국 선행학습 문화와의 비교를 통해 캐나다 교육의 우월성을 차별화(5월 5일, 10일, 11일). 초등~고등학생 부모층을 타겟한 감정적 소구.</w:t>
+        <w:t>미국은 GPA 학점 회복(샤튜브), 명문대 진학 보장 프로그램(EF, 넘버원유학), 보딩스쿨 재정보조(청담엘유학원) 등으로 다층화되어 있다. 캐나다 어학연수 20% 할인 프로모션(밴유하), 호주 시드니 주니어 영어캠프(아이월드) 등 단기 프로그램도 활발하다.</w:t>
       </w:r>
     </w:p>
     <w:p>
@@ -211,51 +145,7 @@
         <w:rPr>
           <w:sz w:val="20"/>
         </w:rPr>
-        <w:t>2. 호주 의료계열(간호, 물리치료, 작업치료) 강세: 코코스유학원이 호주 의료직군의 고연봉·영주권 가능성을 반복 강조. 취업·이민이 직결된 실용적 정보제공으로 경제적 의사결정 계층 공략.</w:t>
-      </w:r>
-    </w:p>
-    <w:p>
-      <w:pPr>
-        <w:spacing w:after="80"/>
-      </w:pPr>
-      <w:r>
-        <w:rPr>
-          <w:sz w:val="20"/>
-        </w:rPr>
-        <w:t>3. 검정고시 합격 전략 콘텐츠 강화: 내신 5등급, 검정고시 학생들의 명문대 진학 경로를 세밀하게 제시(영유센, 사람사랑, 종로유학원 등). 대입 대수능 불안층의 대안진학 욕구에 포커스.</w:t>
-      </w:r>
-    </w:p>
-    <w:p>
-      <w:pPr>
-        <w:spacing w:after="80"/>
-      </w:pPr>
-      <w:r>
-        <w:rPr>
-          <w:sz w:val="20"/>
-        </w:rPr>
-        <w:t>4. 조기유학 컨설팅의 '입학 후 관리' 강조: 유학피플이 "입학이 끝이 아니다"는 메시지로 원스톱 서비스의 필요성 부각(5월 10~12일). 경쟁사 대비 지속적 케어 가치 커뮤니케이션.</w:t>
-      </w:r>
-    </w:p>
-    <w:p>
-      <w:pPr>
-        <w:spacing w:after="80"/>
-      </w:pPr>
-      <w:r>
-        <w:rPr>
-          <w:sz w:val="20"/>
-        </w:rPr>
-        <w:t>5. 단기 프로그램(영어캠프, 여름방학 스쿨링)의 세분화: 유홈즈, 커넥티드 등이 일주일~8주 프로그램을 계절별·지역별로 다양화하여 바쁜 직장인 부모층 공략.</w:t>
-      </w:r>
-    </w:p>
-    <w:p>
-      <w:pPr>
-        <w:spacing w:after="80"/>
-      </w:pPr>
-      <w:r>
-        <w:rPr>
-          <w:sz w:val="20"/>
-        </w:rPr>
-        <w:t>6. 미국 대학 에세이/AI 이슈 콘텐츠화: 종로유학원이 AI 활용 윤리 가이드(5월 8일)를 제시하며 입시 불확실성을 해소해주는 정보 제공자 포지셔닝.</w:t>
+        <w:t>필리핀 어학연수 비교(유학피플), 뉴질랜드 자녀 무상교육(코코스), 싱가포르 석사(AAA유학)까지 국가별 전문성이 강화되는 추세다.</w:t>
       </w:r>
     </w:p>
     <w:p/>
@@ -280,173 +170,29 @@
         <w:rPr>
           <w:sz w:val="20"/>
         </w:rPr>
-        <w:t>제안 1: 시니어 어학연수 타겟 광고 캠페인</w:t>
+        <w:t>1. "약대 진학, 영국이 답이다" 캠페인 - 영국약대 파운데이션의 '3년 과정+빠른 진학+취업 보장' 메시지로 미국약대(6~8년 고비용)와 직접 비교 광고. 대상: 고등학교 3학년, 재수생(GPA 4.0 이상). 카피: "미국 약대는 7년, 영국은 3년. 시간도 비용도 절반 이하"</w:t>
       </w:r>
     </w:p>
     <w:p>
       <w:pPr>
-        <w:pStyle w:val="ListBullet"/>
-        <w:spacing w:after="60"/>
+        <w:spacing w:after="80"/>
       </w:pPr>
       <w:r>
         <w:rPr>
           <w:sz w:val="20"/>
         </w:rPr>
-        <w:t>타겟: 45~65세 직장/은퇴층</w:t>
+        <w:t>2. "50대 이상도 영어 유창해진다" 시니어 어학연수 캠페인 - 영유닷의 50~60대 학생 후기를 벤치마크하며 정년 후 제2의 커리어 세그먼트 공략. 카피: "나이는 숫자일 뿐, 런던에선 누구나 영어 공부꾼"</w:t>
       </w:r>
     </w:p>
     <w:p>
       <w:pPr>
-        <w:pStyle w:val="ListBullet"/>
-        <w:spacing w:after="60"/>
+        <w:spacing w:after="80"/>
       </w:pPr>
       <w:r>
         <w:rPr>
           <w:sz w:val="20"/>
         </w:rPr>
-        <w:t>카피: "영어 능력 향상이 아닌, 제2의 시작. 50대도 런던에서 새로운 친구들을 만나고 있습니다"</w:t>
-      </w:r>
-    </w:p>
-    <w:p>
-      <w:pPr>
-        <w:pStyle w:val="ListBullet"/>
-        <w:spacing w:after="60"/>
-      </w:pPr>
-      <w:r>
-        <w:rPr>
-          <w:sz w:val="20"/>
-        </w:rPr>
-        <w:t>광고 소재: 실제 중장년 수강생의 일상 영상(카페 토론, 박물관 투어) + 심리적 성취감</w:t>
-      </w:r>
-    </w:p>
-    <w:p>
-      <w:pPr>
-        <w:pStyle w:val="ListBullet"/>
-        <w:spacing w:after="60"/>
-      </w:pPr>
-      <w:r>
-        <w:rPr>
-          <w:sz w:val="20"/>
-        </w:rPr>
-        <w:t>플랫폼: 페이스북(50대 이상), 구글 디스플레이 네트워크</w:t>
-      </w:r>
-    </w:p>
-    <w:p>
-      <w:pPr>
-        <w:spacing w:after="80"/>
-      </w:pPr>
-      <w:r>
-        <w:rPr>
-          <w:sz w:val="20"/>
-        </w:rPr>
-        <w:t>제안 2: 약학대학 진학 명확화 광고</w:t>
-      </w:r>
-    </w:p>
-    <w:p>
-      <w:pPr>
-        <w:pStyle w:val="ListBullet"/>
-        <w:spacing w:after="60"/>
-      </w:pPr>
-      <w:r>
-        <w:rPr>
-          <w:sz w:val="20"/>
-        </w:rPr>
-        <w:t>타겟: 고등학생 부모(의료계 진학 관심층)</w:t>
-      </w:r>
-    </w:p>
-    <w:p>
-      <w:pPr>
-        <w:pStyle w:val="ListBullet"/>
-        <w:spacing w:after="60"/>
-      </w:pPr>
-      <w:r>
-        <w:rPr>
-          <w:sz w:val="20"/>
-        </w:rPr>
-        <w:t>카피: "약학대 합격률 70% 이상. 영국 약대는 한국보다 1년 빠르고 450만원 저렴합니다"</w:t>
-      </w:r>
-    </w:p>
-    <w:p>
-      <w:pPr>
-        <w:pStyle w:val="ListBullet"/>
-        <w:spacing w:after="60"/>
-      </w:pPr>
-      <w:r>
-        <w:rPr>
-          <w:sz w:val="20"/>
-        </w:rPr>
-        <w:t>광고 소재: 파운데이션 입학부터 약대 진학까지의 타임라인 인포그래픽 + 실제 합격생 인터뷰</w:t>
-      </w:r>
-    </w:p>
-    <w:p>
-      <w:pPr>
-        <w:pStyle w:val="ListBullet"/>
-        <w:spacing w:after="60"/>
-      </w:pPr>
-      <w:r>
-        <w:rPr>
-          <w:sz w:val="20"/>
-        </w:rPr>
-        <w:t>플랫폼: 유튜브(의대·약대 관심층), 틱톡(고2~대입 수험생)</w:t>
-      </w:r>
-    </w:p>
-    <w:p>
-      <w:pPr>
-        <w:spacing w:after="80"/>
-      </w:pPr>
-      <w:r>
-        <w:rPr>
-          <w:sz w:val="20"/>
-        </w:rPr>
-        <w:t>제안 3: 검정고시 → 명문대 합격 경로 광고</w:t>
-      </w:r>
-    </w:p>
-    <w:p>
-      <w:pPr>
-        <w:pStyle w:val="ListBullet"/>
-        <w:spacing w:after="60"/>
-      </w:pPr>
-      <w:r>
-        <w:rPr>
-          <w:sz w:val="20"/>
-        </w:rPr>
-        <w:t>타겟: 검정고시 응시 예정자, 대안학교 학부모</w:t>
-      </w:r>
-    </w:p>
-    <w:p>
-      <w:pPr>
-        <w:pStyle w:val="ListBullet"/>
-        <w:spacing w:after="60"/>
-      </w:pPr>
-      <w:r>
-        <w:rPr>
-          <w:sz w:val="20"/>
-        </w:rPr>
-        <w:t>카피: "내신 4~5등급 상관없다. 런던 LSE 파운데이션으로 명문대 입학 보장 가능"</w:t>
-      </w:r>
-    </w:p>
-    <w:p>
-      <w:pPr>
-        <w:pStyle w:val="ListBullet"/>
-        <w:spacing w:after="60"/>
-      </w:pPr>
-      <w:r>
-        <w:rPr>
-          <w:sz w:val="20"/>
-        </w:rPr>
-        <w:t>광고 소재: Before/After 구조(검정고시 성적→LSE 입학 합격증)</w:t>
-      </w:r>
-    </w:p>
-    <w:p>
-      <w:pPr>
-        <w:pStyle w:val="ListBullet"/>
-        <w:spacing w:after="60"/>
-      </w:pPr>
-      <w:r>
-        <w:rPr>
-          <w:sz w:val="20"/>
-        </w:rPr>
-        <w:t>플랫폼: 네이버 검색(검정고시 관련 키워드), 인스타그램 릴스</w:t>
+        <w:t>3. "호주 물리치료사, 연봉 1억+영주권" 직무-이민 연계 광고 - 호주의 고급 의료 직군 수요 트렌드 활용. 대상: 대학 2~3학년(전공 전환 가능성 높음). 소재: 취업 후 임금표, 영주권 조건 타임라인 인포그래픽</w:t>
       </w:r>
     </w:p>
     <w:p/>
@@ -471,170 +217,29 @@
         <w:rPr>
           <w:sz w:val="20"/>
         </w:rPr>
-        <w:t>제안 1: 감정 기반 다큐식 콘텐츠 - "유학 가기 전 몰랐던 현실들"</w:t>
+        <w:t>1. "교수가 직접 안내하는 현장 투어" 시리즈 - SAUK의 약대 투어, 영유닷의 교수 동반 투어가 높은 신뢰도를 받음. 자사가 홍보하는 대학의 입학사정관, 학과장 인터뷰 투어 영상 제작. 타이틀 예: "[QUT 인터뷰] 호주 공대 선호도 1위, 인공지능 학과 교수가 말하는 커리큘럼 비결"</w:t>
       </w:r>
     </w:p>
     <w:p>
       <w:pPr>
-        <w:pStyle w:val="ListBullet"/>
-        <w:spacing w:after="60"/>
+        <w:spacing w:after="80"/>
       </w:pPr>
       <w:r>
         <w:rPr>
           <w:sz w:val="20"/>
         </w:rPr>
-        <w:t>경쟁사 분석: 샤튜브(GPA 망친 학생 해결책), 종로유학원(손흥민 경기 관람), 유학피플(조기유학 입학 후 고민)은 모두 '예상과 다른 현실'을 콘텐츠화하여 높은 조회수 기록</w:t>
+        <w:t>2. "나이별·목표별 유학 후기" 버티컬 시리즈 - 영유닷의 시니어 어학연수 후기가 틈새 시장을 확보함. 자사의 다양한 연령대 학생(20대 신입생, 30대 석사, 40대 경력 전환, 50대 제2인생) 후기를 체계화. 시간당 조회수를 측정하며 공략 타겟 정밀화</w:t>
       </w:r>
     </w:p>
     <w:p>
       <w:pPr>
-        <w:pStyle w:val="ListBullet"/>
-        <w:spacing w:after="60"/>
+        <w:spacing w:after="80"/>
       </w:pPr>
       <w:r>
         <w:rPr>
           <w:sz w:val="20"/>
         </w:rPr>
-        <w:t>추천 주제: "호주 워홀 카페잡, 어학연수 때 결판난다" (자사 콘텐츠 강점 활용) → 확장하여 "영국 파운데이션, 대학 입학이 아니라 여긴 고등학교 2학년이었다"는 생생한 현지 경험담</w:t>
-      </w:r>
-    </w:p>
-    <w:p>
-      <w:pPr>
-        <w:pStyle w:val="ListBullet"/>
-        <w:spacing w:after="60"/>
-      </w:pPr>
-      <w:r>
-        <w:rPr>
-          <w:sz w:val="20"/>
-        </w:rPr>
-        <w:t>제작 전략: 1인칭 일상 일지 형식, 4~6분 숏폼 콘텐츠, 1개월 시리즈화</w:t>
-      </w:r>
-    </w:p>
-    <w:p>
-      <w:pPr>
-        <w:spacing w:after="80"/>
-      </w:pPr>
-      <w:r>
-        <w:rPr>
-          <w:sz w:val="20"/>
-        </w:rPr>
-        <w:t>제안 2: 경험자 비교 콘텐츠 - "약대 합격생이 직접 비교해드립니다"</w:t>
-      </w:r>
-    </w:p>
-    <w:p>
-      <w:pPr>
-        <w:pStyle w:val="ListBullet"/>
-        <w:spacing w:after="60"/>
-      </w:pPr>
-      <w:r>
-        <w:rPr>
-          <w:sz w:val="20"/>
-        </w:rPr>
-        <w:t>경쟁사 분석: SAUK의 약대 시리즈(5월 11일 3연속 투고)는 선택지 비교 포맷으로 결정 마비 해소</w:t>
-      </w:r>
-    </w:p>
-    <w:p>
-      <w:pPr>
-        <w:pStyle w:val="ListBullet"/>
-        <w:spacing w:after="60"/>
-      </w:pPr>
-      <w:r>
-        <w:rPr>
-          <w:sz w:val="20"/>
-        </w:rPr>
-        <w:t>추천 주제: "영국 약대 vs 호주 약대 vs 미국 약대: 합격 난이도·학비·취업 비교" 또는 "파운데이션 4곳 합격 후 실제 선택한 학교는?"</w:t>
-      </w:r>
-    </w:p>
-    <w:p>
-      <w:pPr>
-        <w:pStyle w:val="ListBullet"/>
-        <w:spacing w:after="60"/>
-      </w:pPr>
-      <w:r>
-        <w:rPr>
-          <w:sz w:val="20"/>
-        </w:rPr>
-        <w:t>제작 전략: 인터뷰 기반 직설적 조언(카피: "정직하게 말씀해주세요"), 자막과 텍스트로 객관적 수치 병행</w:t>
-      </w:r>
-    </w:p>
-    <w:p>
-      <w:pPr>
-        <w:spacing w:after="80"/>
-      </w:pPr>
-      <w:r>
-        <w:rPr>
-          <w:sz w:val="20"/>
-        </w:rPr>
-        <w:t>제안 3: 숏폼 팁 콘텐츠 시리즈 - "#유학꿀팁"</w:t>
-      </w:r>
-    </w:p>
-    <w:p>
-      <w:pPr>
-        <w:pStyle w:val="ListBullet"/>
-        <w:spacing w:after="60"/>
-      </w:pPr>
-      <w:r>
-        <w:rPr>
-          <w:sz w:val="20"/>
-        </w:rPr>
-        <w:t>경쟁사 분석: 종로유학원의 AI 에세이 이슈, 라임에듀케이션의 캐나다 쉬는시간 문화 소개 등이 일상 속 실질적 정보로 높은 엔가지먼트 기록</w:t>
-      </w:r>
-    </w:p>
-    <w:p>
-      <w:pPr>
-        <w:pStyle w:val="ListBullet"/>
-        <w:spacing w:after="60"/>
-      </w:pPr>
-      <w:r>
-        <w:rPr>
-          <w:sz w:val="20"/>
-        </w:rPr>
-        <w:t>추천 주제:</w:t>
-      </w:r>
-    </w:p>
-    <w:p>
-      <w:pPr>
-        <w:spacing w:after="80"/>
-      </w:pPr>
-      <w:r>
-        <w:rPr>
-          <w:sz w:val="20"/>
-        </w:rPr>
-        <w:t>① "듀오링고만으로 대학 입학 가능한 이유" (캐노유 사례 활용)</w:t>
-      </w:r>
-    </w:p>
-    <w:p>
-      <w:pPr>
-        <w:spacing w:after="80"/>
-      </w:pPr>
-      <w:r>
-        <w:rPr>
-          <w:sz w:val="20"/>
-        </w:rPr>
-        <w:t>② "영국 조기유학, 비인가교 vs 인가교 차이" (사람사랑 트렌드 반영)</w:t>
-      </w:r>
-    </w:p>
-    <w:p>
-      <w:pPr>
-        <w:spacing w:after="80"/>
-      </w:pPr>
-      <w:r>
-        <w:rPr>
-          <w:sz w:val="20"/>
-        </w:rPr>
-        <w:t>③ "호주 물리치료사, 왜 갑자기 한국에서 공부 안 할까?"</w:t>
-      </w:r>
-    </w:p>
-    <w:p>
-      <w:pPr>
-        <w:pStyle w:val="ListBullet"/>
-        <w:spacing w:after="60"/>
-      </w:pPr>
-      <w:r>
-        <w:rPr>
-          <w:sz w:val="20"/>
-        </w:rPr>
-        <w:t>제작 전략: 15~30초, 주 3회 게시, 댓글 질문 Q&amp;A 형식 답변</w:t>
+        <w:t>3. "비용 투명화: 꼼꼼하게 계산하기" 시리즈 - SAUK의 "가성비 TOP 4" 비교, IDP의 "5000만원 예산 가능" 등 구체적 수치가 클릭을 높임. 자사의 학교별 '학비+숙소+생활비+항공료' 총정산 영상. 환율 변동성도 고려한 월별 비용 추이 차트</w:t>
       </w:r>
     </w:p>
     <w:p/>
@@ -659,55 +264,112 @@
         <w:rPr>
           <w:sz w:val="20"/>
         </w:rPr>
-        <w:t>제안 1: 검색 의도 기반 SEO 콘텐츠 - 파운데이션 비용 상세 가이드</w:t>
+        <w:t>1. "영국약대 파운데이션 vs 미국약대 프리메드" 비교 가이드 - 검색 의도: 약학 진학 목표자의 국가 선택 기로. 타이틀: "[약대 진학 결정기] 영국 약대 3년vs미국 약대 6년, 학비·시간·취업까지 완벽 비교" / SEO 키워드: 영국약대, 파운데이션, 약대 유학 비용, 약사 진로 / 구성: 입학 조건, 수업 난이도, 국가고시 난이도, 졸업 후 연봉 비교 테이블</w:t>
       </w:r>
     </w:p>
     <w:p>
       <w:pPr>
-        <w:pStyle w:val="ListBullet"/>
-        <w:spacing w:after="60"/>
+        <w:spacing w:after="80"/>
       </w:pPr>
       <w:r>
         <w:rPr>
           <w:sz w:val="20"/>
         </w:rPr>
-        <w:t>타겟 키워드: "영국 파운데이션 비용", "영국 파운데이션 합격률", "LSE 파운데이션 학비", "브라이튼 파운데이션 입학조건"</w:t>
+        <w:t>2. "호주 의료 직군 영주권 로드맵" 심화 가이드 - 경쟁사(코코스, IBN)가 물리치료·간호에 집중했으므로 차별화. 타이틀: "[호주 영주권 완벽 가이드] 물리치료사·간호사·작업치료사 졸업 후 직업 비자~영주권까지 1년 타임라인" / SEO 키워드: 호주 영주권, 호주 물리치료, 호주 간호사 채용, skilled migration / 구성: 교육기관 선택→인턴십→직무 경험→비자 신청 단계별 체크리스트, 비용 총액</w:t>
       </w:r>
     </w:p>
     <w:p>
       <w:pPr>
-        <w:pStyle w:val="ListBullet"/>
-        <w:spacing w:after="60"/>
+        <w:spacing w:after="80"/>
       </w:pPr>
       <w:r>
         <w:rPr>
           <w:sz w:val="20"/>
         </w:rPr>
-        <w:t>경쟁사 분석: IDP가 "온캠퍼스 런던 파운데이션 입학조건 총정리"(5월 11일)로 명확한 학교별 정보 제시</w:t>
+        <w:t>3. "아일랜드 어학연수 숨은 가성비" 신규 국가 공략 - 자사 블로그 "아일랜드 어학연수 비용" 포스팅 기반으로 확대. 타이틀: "[숨겨진 가성비] 영국 어학연수보다 30% 저렴한 아일랜드 더블린, 왜 한국 유학생은 모를까?" / SEO 키워드: 아일랜드 어학연수, 더블린 영어학교, 영국보다 싼 유학 / 구성: 영국 런던/브라이튼과의 월별 생활비 비교, 아일랜드만의 취업 기회(EU 접근성), 아일랜드 워킹홀리데이 조건</w:t>
+      </w:r>
+    </w:p>
+    <w:p/>
+    <w:p>
+      <w:pPr>
+        <w:spacing w:before="200" w:after="80"/>
+      </w:pPr>
+      <w:r>
+        <w:rPr>
+          <w:b/>
+          <w:color w:val="2E75B6"/>
+          <w:sz w:val="24"/>
+        </w:rPr>
+        <w:t>📸 인스타그램 담당자 액션 제안</w:t>
       </w:r>
     </w:p>
     <w:p>
       <w:pPr>
-        <w:pStyle w:val="ListBullet"/>
-        <w:spacing w:after="60"/>
+        <w:spacing w:after="80"/>
       </w:pPr>
       <w:r>
         <w:rPr>
           <w:sz w:val="20"/>
         </w:rPr>
-        <w:t>포스팅 아이디어: "2026 영국 파운데이션 top 5 학교 비용·난이도·명문대 진학률 비교" (1,200~1,500자 + 비교표 인포그래픽)</w:t>
+        <w:t>1. "#50대도늦지않아" 시니어 유학생 일상 릴스 - 영유닷의 시니어 어학연수 후기가 감정적 공감을 얻음. 자사 학생이 있다면 "영어 수업→카페 데이트→박물관 투어→발표 순간" 5~10초 숏폼 영상을 주 2~3회 업로드. 자막: "50대, 영어 못해도 영국에선 용감해진다" 스타일의 희망 메시지</w:t>
       </w:r>
     </w:p>
     <w:p>
       <w:pPr>
-        <w:pStyle w:val="ListBullet"/>
-        <w:spacing w:after="60"/>
+        <w:spacing w:after="80"/>
       </w:pPr>
       <w:r>
         <w:rPr>
           <w:sz w:val="20"/>
         </w:rPr>
-        <w:t>내부 링크 전략: 자사 약대 합격 후기→파운데이션 입학</w:t>
+        <w:t>2. "학비 vs 실제 생활비" 인포그래픽 카루셀 - SAUK의 "가성비 TOP 4", IDP의 "장학금 현황" 등 수치 기반 콘텐츠가 저장/공유율 높음. 각 국가별(영국/호주/캐나다) 또는 각 도시별(런던/시드니/밴쿠버) "월급여 대비 생활비" 비율을 시각화한 슬라이드 카루셀 매주 1회 게시</w:t>
+      </w:r>
+    </w:p>
+    <w:p>
+      <w:pPr>
+        <w:spacing w:after="80"/>
+      </w:pPr>
+      <w:r>
+        <w:rPr>
+          <w:sz w:val="20"/>
+        </w:rPr>
+        <w:t>3. "오늘의 캐퍼스: 입학사정관이 추천하는 명소" UGC 스타일 - 경쟁사의 현장 투어, 학생 후기가 높은 신뢰도를 보임. 자사의 현지 학생/동문을 통해 "이 학교의 숨은 핫플레이스" 사진(카페, 도서관, 실험실, 운동장)과 짧은 캡션("여기서 과제 할 때가 제일 공부 잘 돼요") 릴스. 사용자 리뷰 느낌의 자연스러움 강조</w:t>
+      </w:r>
+    </w:p>
+    <w:p/>
+    <w:p>
+      <w:pPr>
+        <w:spacing w:before="200" w:after="80"/>
+      </w:pPr>
+      <w:r>
+        <w:rPr>
+          <w:b/>
+          <w:color w:val="2E75B6"/>
+          <w:sz w:val="24"/>
+        </w:rPr>
+        <w:t>🔍 이번 주 주목 경쟁사</w:t>
+      </w:r>
+    </w:p>
+    <w:p>
+      <w:pPr>
+        <w:spacing w:after="80"/>
+      </w:pPr>
+      <w:r>
+        <w:rPr>
+          <w:sz w:val="20"/>
+        </w:rPr>
+        <w:t>1. SAUK - 가장 활발한 전략적 움직임. 영국약대를 핵심으로 파운데이션 입학 조건, 비용 비교, 무료 수속 캠페인을 매일 반복 노출시켜 상위 노출 점유율을 높였다. 영국약대 시장에서의 점유율 방어 의도가 명확하며, 지방 대학(선더랜드, 아스톤, 브라이튼)의 저비용 메시지로 가격 민감층을 공략 중이다. 유학박람회 현장 마케팅까지 병행하며 온라인-오프라인 통합 전략을 펼치고 있다.</w:t>
+      </w:r>
+    </w:p>
+    <w:p>
+      <w:pPr>
+        <w:spacing w:after="80"/>
+      </w:pPr>
+      <w:r>
+        <w:rPr>
+          <w:sz w:val="20"/>
+        </w:rPr>
+        <w:t>2</w:t>
       </w:r>
     </w:p>
     <w:p/>

</xml_diff>